<commit_message>
#Se crea descripcion UC-16
</commit_message>
<xml_diff>
--- a/Descripcion-UC/Descripcion-UC010.docx
+++ b/Descripcion-UC/Descripcion-UC010.docx
@@ -54,7 +54,7 @@
               <w:rPr>
                 <w:rFonts w:hint="default"/>
               </w:rPr>
-              <w:t>Emitir nota de crédito</w:t>
+              <w:t>Generar score de crédito predictivo</w:t>
             </w:r>
           </w:p>
         </w:tc>
@@ -86,10 +86,7 @@
                 <w:rFonts w:hint="default"/>
                 <w:lang w:val="es-MX"/>
               </w:rPr>
-              <w:t>1</w:t>
-            </w:r>
-            <w:r>
-              <w:t>0</w:t>
+              <w:t>16</w:t>
             </w:r>
           </w:p>
         </w:tc>
@@ -475,6 +472,10 @@
             <w:pPr>
               <w:widowControl w:val="0"/>
               <w:spacing w:after="0"/>
+              <w:rPr>
+                <w:rFonts w:hint="default"/>
+                <w:lang w:val="es-MX"/>
+              </w:rPr>
             </w:pPr>
             <w:r>
               <mc:AlternateContent>
@@ -565,8 +566,9 @@
             <w:r>
               <w:rPr>
                 <w:rFonts w:hint="default"/>
-              </w:rPr>
-              <w:t>Cajero</w:t>
+                <w:lang w:val="es-MX"/>
+              </w:rPr>
+              <w:t>Sistema</w:t>
             </w:r>
           </w:p>
         </w:tc>
@@ -667,9 +669,8 @@
             <w:r>
               <w:rPr>
                 <w:rFonts w:hint="default"/>
-                <w:lang w:val="es-MX"/>
-              </w:rPr>
-              <w:t>-</w:t>
+              </w:rPr>
+              <w:t>Sistema externo de créditos</w:t>
             </w:r>
           </w:p>
         </w:tc>
@@ -709,81 +710,10 @@
                     <wp:anchor distT="6350" distB="6350" distL="6350" distR="6350" simplePos="0" relativeHeight="251659264" behindDoc="0" locked="0" layoutInCell="1" allowOverlap="1">
                       <wp:simplePos x="0" y="0"/>
                       <wp:positionH relativeFrom="column">
-                        <wp:posOffset>3084195</wp:posOffset>
+                        <wp:posOffset>3006725</wp:posOffset>
                       </wp:positionH>
                       <wp:positionV relativeFrom="paragraph">
-                        <wp:posOffset>41910</wp:posOffset>
-                      </wp:positionV>
-                      <wp:extent cx="134620" cy="104775"/>
-                      <wp:effectExtent l="6350" t="6985" r="6350" b="5715"/>
-                      <wp:wrapNone/>
-                      <wp:docPr id="7" name="Forma7"/>
-                      <wp:cNvGraphicFramePr/>
-                      <a:graphic xmlns:a="http://schemas.openxmlformats.org/drawingml/2006/main">
-                        <a:graphicData uri="http://schemas.microsoft.com/office/word/2010/wordprocessingShape">
-                          <wps:wsp>
-                            <wps:cNvSpPr/>
-                            <wps:spPr>
-                              <a:xfrm>
-                                <a:off x="0" y="0"/>
-                                <a:ext cx="134640" cy="104760"/>
-                              </a:xfrm>
-                              <a:prstGeom prst="rect">
-                                <a:avLst/>
-                              </a:prstGeom>
-                              <a:solidFill>
-                                <a:srgbClr val="FFFFFF"/>
-                              </a:solidFill>
-                              <a:ln w="12600">
-                                <a:solidFill>
-                                  <a:srgbClr val="000000"/>
-                                </a:solidFill>
-                                <a:prstDash val="dash"/>
-                                <a:round/>
-                              </a:ln>
-                            </wps:spPr>
-                            <wps:style>
-                              <a:lnRef idx="0">
-                                <a:scrgbClr r="0" g="0" b="0"/>
-                              </a:lnRef>
-                              <a:fillRef idx="0">
-                                <a:scrgbClr r="0" g="0" b="0"/>
-                              </a:fillRef>
-                              <a:effectRef idx="0">
-                                <a:scrgbClr r="0" g="0" b="0"/>
-                              </a:effectRef>
-                              <a:fontRef idx="minor"/>
-                            </wps:style>
-                            <wps:bodyPr/>
-                          </wps:wsp>
-                        </a:graphicData>
-                      </a:graphic>
-                    </wp:anchor>
-                  </w:drawing>
-                </mc:Choice>
-                <mc:Fallback>
-                  <w:pict>
-                    <v:rect id="Forma7" o:spid="_x0000_s1026" o:spt="1" style="position:absolute;left:0pt;margin-left:242.85pt;margin-top:3.3pt;height:8.25pt;width:10.6pt;z-index:251659264;mso-width-relative:page;mso-height-relative:page;" fillcolor="#FFFFFF" filled="t" stroked="t" coordsize="21600,21600" o:gfxdata="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">
-                      <v:fill on="t" focussize="0,0"/>
-                      <v:stroke weight="0.992125984251969pt" color="#000000" joinstyle="round" dashstyle="dash"/>
-                      <v:imagedata o:title=""/>
-                      <o:lock v:ext="edit" aspectratio="f"/>
-                    </v:rect>
-                  </w:pict>
-                </mc:Fallback>
-              </mc:AlternateContent>
-            </w:r>
-            <w:r>
-              <mc:AlternateContent>
-                <mc:Choice Requires="wps">
-                  <w:drawing>
-                    <wp:anchor distT="6350" distB="6350" distL="6350" distR="6350" simplePos="0" relativeHeight="251659264" behindDoc="0" locked="0" layoutInCell="1" allowOverlap="1">
-                      <wp:simplePos x="0" y="0"/>
-                      <wp:positionH relativeFrom="column">
-                        <wp:posOffset>2062480</wp:posOffset>
-                      </wp:positionH>
-                      <wp:positionV relativeFrom="paragraph">
-                        <wp:posOffset>37465</wp:posOffset>
+                        <wp:posOffset>31115</wp:posOffset>
                       </wp:positionV>
                       <wp:extent cx="166370" cy="107950"/>
                       <wp:effectExtent l="6350" t="6350" r="6350" b="6350"/>
@@ -844,11 +774,82 @@
                 </mc:Choice>
                 <mc:Fallback>
                   <w:pict>
-                    <v:rect id="Forma8" o:spid="_x0000_s1026" o:spt="1" style="position:absolute;left:0pt;margin-left:162.4pt;margin-top:2.95pt;height:8.5pt;width:13.1pt;z-index:251659264;mso-width-relative:page;mso-height-relative:page;" fillcolor="#666666" filled="t" stroked="t" coordsize="21600,21600" o:gfxdata="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">
+                    <v:rect id="Forma8" o:spid="_x0000_s1026" o:spt="1" style="position:absolute;left:0pt;margin-left:236.75pt;margin-top:2.45pt;height:8.5pt;width:13.1pt;z-index:251659264;mso-width-relative:page;mso-height-relative:page;" fillcolor="#666666" filled="t" stroked="t" coordsize="21600,21600" o:gfxdata="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">
                       <v:fill type="gradient" on="t" color2="#000000" angle="180" focus="50%" focussize="0,0">
                         <o:fill type="gradientUnscaled" v:ext="backwardCompatible"/>
                       </v:fill>
                       <v:stroke weight="0.992125984251969pt" color="#000000" joinstyle="round"/>
+                      <v:imagedata o:title=""/>
+                      <o:lock v:ext="edit" aspectratio="f"/>
+                    </v:rect>
+                  </w:pict>
+                </mc:Fallback>
+              </mc:AlternateContent>
+            </w:r>
+            <w:r>
+              <mc:AlternateContent>
+                <mc:Choice Requires="wps">
+                  <w:drawing>
+                    <wp:anchor distT="6350" distB="6350" distL="6350" distR="6350" simplePos="0" relativeHeight="251659264" behindDoc="0" locked="0" layoutInCell="1" allowOverlap="1">
+                      <wp:simplePos x="0" y="0"/>
+                      <wp:positionH relativeFrom="column">
+                        <wp:posOffset>2016125</wp:posOffset>
+                      </wp:positionH>
+                      <wp:positionV relativeFrom="paragraph">
+                        <wp:posOffset>41910</wp:posOffset>
+                      </wp:positionV>
+                      <wp:extent cx="134620" cy="104775"/>
+                      <wp:effectExtent l="6350" t="6985" r="6350" b="5715"/>
+                      <wp:wrapNone/>
+                      <wp:docPr id="7" name="Forma7"/>
+                      <wp:cNvGraphicFramePr/>
+                      <a:graphic xmlns:a="http://schemas.openxmlformats.org/drawingml/2006/main">
+                        <a:graphicData uri="http://schemas.microsoft.com/office/word/2010/wordprocessingShape">
+                          <wps:wsp>
+                            <wps:cNvSpPr/>
+                            <wps:spPr>
+                              <a:xfrm>
+                                <a:off x="0" y="0"/>
+                                <a:ext cx="134640" cy="104760"/>
+                              </a:xfrm>
+                              <a:prstGeom prst="rect">
+                                <a:avLst/>
+                              </a:prstGeom>
+                              <a:solidFill>
+                                <a:srgbClr val="FFFFFF"/>
+                              </a:solidFill>
+                              <a:ln w="12600">
+                                <a:solidFill>
+                                  <a:srgbClr val="000000"/>
+                                </a:solidFill>
+                                <a:prstDash val="dash"/>
+                                <a:round/>
+                              </a:ln>
+                            </wps:spPr>
+                            <wps:style>
+                              <a:lnRef idx="0">
+                                <a:scrgbClr r="0" g="0" b="0"/>
+                              </a:lnRef>
+                              <a:fillRef idx="0">
+                                <a:scrgbClr r="0" g="0" b="0"/>
+                              </a:fillRef>
+                              <a:effectRef idx="0">
+                                <a:scrgbClr r="0" g="0" b="0"/>
+                              </a:effectRef>
+                              <a:fontRef idx="minor"/>
+                            </wps:style>
+                            <wps:bodyPr/>
+                          </wps:wsp>
+                        </a:graphicData>
+                      </a:graphic>
+                    </wp:anchor>
+                  </w:drawing>
+                </mc:Choice>
+                <mc:Fallback>
+                  <w:pict>
+                    <v:rect id="Forma7" o:spid="_x0000_s1026" o:spt="1" style="position:absolute;left:0pt;margin-left:158.75pt;margin-top:3.3pt;height:8.25pt;width:10.6pt;z-index:251659264;mso-width-relative:page;mso-height-relative:page;" fillcolor="#FFFFFF" filled="t" stroked="t" coordsize="21600,21600" o:gfxdata="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">
+                      <v:fill on="t" focussize="0,0"/>
+                      <v:stroke weight="0.992125984251969pt" color="#000000" joinstyle="round" dashstyle="dash"/>
                       <v:imagedata o:title=""/>
                       <o:lock v:ext="edit" aspectratio="f"/>
                     </v:rect>
@@ -970,7 +971,7 @@
                 <w:rFonts w:hint="default"/>
                 <w:lang w:val="es-MX"/>
               </w:rPr>
-              <w:t xml:space="preserve"> Emitir una nota de crédito para anular o corregir total o parcialmente una factura, respetando el tipo y los impuestos del comprobante original.</w:t>
+              <w:t xml:space="preserve"> Generar un puntaje de crédito del cliente en base a su historial de compras y comportamiento de pagos, para asistir en la evaluación de solicitudes de crédito.</w:t>
             </w:r>
           </w:p>
         </w:tc>
@@ -1016,19 +1017,34 @@
               <w:rPr>
                 <w:rFonts w:hint="default"/>
               </w:rPr>
-              <w:t>- El cajero debe estar autenticado.</w:t>
-            </w:r>
-          </w:p>
-          <w:p>
-            <w:pPr>
-              <w:widowControl w:val="0"/>
-              <w:spacing w:after="0"/>
-            </w:pPr>
-            <w:r>
-              <w:rPr>
-                <w:rFonts w:hint="default"/>
-              </w:rPr>
-              <w:t>- Debe existir una factura previamente emitida.</w:t>
+              <w:t>- Debe existir un cliente registrado.</w:t>
+            </w:r>
+          </w:p>
+          <w:p>
+            <w:pPr>
+              <w:widowControl w:val="0"/>
+              <w:spacing w:after="0"/>
+              <w:rPr>
+                <w:rFonts w:hint="default"/>
+              </w:rPr>
+            </w:pPr>
+            <w:r>
+              <w:rPr>
+                <w:rFonts w:hint="default"/>
+              </w:rPr>
+              <w:t>- El cliente debe poseer historial de compras o créditos previos.</w:t>
+            </w:r>
+          </w:p>
+          <w:p>
+            <w:pPr>
+              <w:widowControl w:val="0"/>
+              <w:spacing w:after="0"/>
+            </w:pPr>
+            <w:r>
+              <w:rPr>
+                <w:rFonts w:hint="default"/>
+              </w:rPr>
+              <w:t>- El sistema debe tener acceso a los datos históricos de ventas y créditos.</w:t>
             </w:r>
           </w:p>
         </w:tc>
@@ -1096,19 +1112,19 @@
               <w:rPr>
                 <w:rFonts w:hint="default"/>
               </w:rPr>
-              <w:t>- Se genera la nota de crédito.</w:t>
-            </w:r>
-          </w:p>
-          <w:p>
-            <w:pPr>
-              <w:widowControl w:val="0"/>
-              <w:spacing w:after="0"/>
-            </w:pPr>
-            <w:r>
-              <w:rPr>
-                <w:rFonts w:hint="default"/>
-              </w:rPr>
-              <w:t>- Se ajustan los importes de la venta.</w:t>
+              <w:t>- Se genera un score de crédito para el cliente.</w:t>
+            </w:r>
+          </w:p>
+          <w:p>
+            <w:pPr>
+              <w:widowControl w:val="0"/>
+              <w:spacing w:after="0"/>
+            </w:pPr>
+            <w:r>
+              <w:rPr>
+                <w:rFonts w:hint="default"/>
+              </w:rPr>
+              <w:t>- El score queda disponible para su uso en la evaluación del crédito.</w:t>
             </w:r>
           </w:p>
         </w:tc>
@@ -1164,7 +1180,7 @@
               <w:rPr>
                 <w:rFonts w:hint="default"/>
               </w:rPr>
-              <w:t>- No se genera la nota de crédito.</w:t>
+              <w:t>- No se puede calcular el score por falta de datos.</w:t>
             </w:r>
           </w:p>
         </w:tc>
@@ -1265,7 +1281,7 @@
               <w:rPr>
                 <w:rFonts w:hint="default"/>
               </w:rPr>
-              <w:t>1. El UC comienza cuando el cajero selecciona la opción “Emitir nota de crédito”.</w:t>
+              <w:t>1. El UC comienza cuando el sistema necesita evaluar una solicitud de crédito.</w:t>
             </w:r>
           </w:p>
           <w:p>
@@ -1280,7 +1296,7 @@
               <w:rPr>
                 <w:rFonts w:hint="default"/>
               </w:rPr>
-              <w:t>2. El cajero selecciona la factura original.</w:t>
+              <w:t>2. El sistema obtiene el historial de compras del cliente.</w:t>
             </w:r>
           </w:p>
           <w:p>
@@ -1318,16 +1334,14 @@
                 <w:rFonts w:hint="default"/>
               </w:rPr>
             </w:pPr>
-            <w:r>
-              <w:rPr>
-                <w:rFonts w:hint="default"/>
-              </w:rPr>
-              <w:t>3. El sistema recupera los datos de la factura.</w:t>
-            </w:r>
-          </w:p>
-          <w:p>
-            <w:pPr>
-              <w:widowControl w:val="0"/>
+          </w:p>
+          <w:p>
+            <w:pPr>
+              <w:widowControl w:val="0"/>
+              <w:numPr>
+                <w:ilvl w:val="0"/>
+                <w:numId w:val="1"/>
+              </w:numPr>
               <w:spacing w:after="0" w:line="240" w:lineRule="auto"/>
               <w:rPr>
                 <w:rFonts w:hint="default"/>
@@ -1337,12 +1351,16 @@
               <w:rPr>
                 <w:rFonts w:hint="default"/>
               </w:rPr>
-              <w:t>4. El cajero indica si la nota de crédito es total o parcial.</w:t>
-            </w:r>
-          </w:p>
-          <w:p>
-            <w:pPr>
-              <w:widowControl w:val="0"/>
+              <w:t>El sistema obtiene el historial de créditos y pagos del cliente.</w:t>
+            </w:r>
+          </w:p>
+          <w:p>
+            <w:pPr>
+              <w:widowControl w:val="0"/>
+              <w:numPr>
+                <w:numId w:val="0"/>
+              </w:numPr>
+              <w:suppressAutoHyphens/>
               <w:spacing w:after="0" w:line="240" w:lineRule="auto"/>
               <w:rPr>
                 <w:rFonts w:hint="default"/>
@@ -1352,6 +1370,10 @@
           <w:p>
             <w:pPr>
               <w:widowControl w:val="0"/>
+              <w:numPr>
+                <w:numId w:val="0"/>
+              </w:numPr>
+              <w:suppressAutoHyphens/>
               <w:spacing w:after="0" w:line="240" w:lineRule="auto"/>
               <w:rPr>
                 <w:rFonts w:hint="default"/>
@@ -1366,6 +1388,12 @@
                 <w:rFonts w:hint="default"/>
               </w:rPr>
             </w:pPr>
+            <w:r>
+              <w:rPr>
+                <w:rFonts w:hint="default"/>
+              </w:rPr>
+              <w:t>4. El sistema analiza los datos obtenidos.</w:t>
+            </w:r>
           </w:p>
           <w:p>
             <w:pPr>
@@ -1379,7 +1407,7 @@
               <w:rPr>
                 <w:rFonts w:hint="default"/>
               </w:rPr>
-              <w:t>5. El sistema calcula el importe a devolver.</w:t>
+              <w:t>5. El sistema calcula el score de crédito del cliente.</w:t>
             </w:r>
           </w:p>
           <w:p>
@@ -1394,7 +1422,7 @@
               <w:rPr>
                 <w:rFonts w:hint="default"/>
               </w:rPr>
-              <w:t>6. El sistema calcula los impuestos correspondientes respetando la factura original.</w:t>
+              <w:t>6. El sistema almacena el score generado.</w:t>
             </w:r>
           </w:p>
           <w:p>
@@ -1409,32 +1437,8 @@
               <w:rPr>
                 <w:rFonts w:hint="default"/>
               </w:rPr>
-              <w:t>7. El sistema genera la nota de crédito.</w:t>
-            </w:r>
-          </w:p>
-          <w:p>
-            <w:pPr>
-              <w:widowControl w:val="0"/>
-              <w:spacing w:after="0" w:line="240" w:lineRule="auto"/>
-              <w:rPr>
-                <w:rFonts w:hint="default"/>
-              </w:rPr>
-            </w:pPr>
-            <w:r>
-              <w:rPr>
-                <w:rFonts w:hint="default"/>
-              </w:rPr>
-              <w:t>8. Fin del UC.</w:t>
-            </w:r>
-          </w:p>
-          <w:p>
-            <w:pPr>
-              <w:widowControl w:val="0"/>
-              <w:spacing w:after="0" w:line="240" w:lineRule="auto"/>
-              <w:rPr>
-                <w:rFonts w:hint="default"/>
-              </w:rPr>
-            </w:pPr>
+              <w:t>7. Fin del UC.</w:t>
+            </w:r>
           </w:p>
         </w:tc>
         <w:tc>
@@ -1484,12 +1488,6 @@
                 <w:rFonts w:hint="default"/>
               </w:rPr>
             </w:pPr>
-            <w:r>
-              <w:rPr>
-                <w:rFonts w:hint="default"/>
-              </w:rPr>
-              <w:t>2.1 El sistema no encuentra la factura.</w:t>
-            </w:r>
           </w:p>
           <w:p>
             <w:pPr>
@@ -1506,7 +1504,7 @@
               <w:rPr>
                 <w:rFonts w:hint="default"/>
               </w:rPr>
-              <w:t>2.2 Se informa al usuario.</w:t>
+              <w:t>2.1 El cliente no posee historial suficiente.</w:t>
             </w:r>
           </w:p>
           <w:p>
@@ -1524,7 +1522,7 @@
               <w:rPr>
                 <w:rFonts w:hint="default"/>
               </w:rPr>
-              <w:t>2.3 Se cancela el UC.</w:t>
+              <w:t>2.2 El sistema genera un score por defecto o solicita evaluación externa.</w:t>
             </w:r>
           </w:p>
           <w:p>
@@ -1562,6 +1560,12 @@
                 <w:rFonts w:hint="default"/>
               </w:rPr>
             </w:pPr>
+            <w:r>
+              <w:rPr>
+                <w:rFonts w:hint="default"/>
+              </w:rPr>
+              <w:t>3.1 No se pueden recuperar datos históricos.</w:t>
+            </w:r>
           </w:p>
           <w:p>
             <w:pPr>
@@ -1578,7 +1582,7 @@
               <w:rPr>
                 <w:rFonts w:hint="default"/>
               </w:rPr>
-              <w:t>4.1 El tipo de nota es inválido.</w:t>
+              <w:t>3.2 Se cancela el cálculo del score.</w:t>
             </w:r>
           </w:p>
           <w:p>
@@ -1592,12 +1596,6 @@
                 <w:rFonts w:hint="default"/>
               </w:rPr>
             </w:pPr>
-            <w:r>
-              <w:rPr>
-                <w:rFonts w:hint="default"/>
-              </w:rPr>
-              <w:t>4.2 Se solicita corrección.</w:t>
-            </w:r>
           </w:p>
         </w:tc>
       </w:tr>
@@ -1678,7 +1676,7 @@
               <w:rPr>
                 <w:rFonts w:hint="default"/>
               </w:rPr>
-              <w:t>Seleccionar factura original</w:t>
+              <w:t>Obtener historial de ventas</w:t>
             </w:r>
             <w:r>
               <w:rPr>
@@ -1691,33 +1689,20 @@
               <w:rPr>
                 <w:rFonts w:hint="default"/>
               </w:rPr>
-              <w:t>Determinar tipo de nota</w:t>
+              <w:t>Obtener historial de créditos</w:t>
             </w:r>
             <w:r>
               <w:rPr>
                 <w:rFonts w:hint="default"/>
                 <w:lang w:val="es-MX"/>
               </w:rPr>
-              <w:t xml:space="preserve">, </w:t>
-            </w:r>
-            <w:r>
-              <w:rPr>
-                <w:rFonts w:hint="default"/>
-              </w:rPr>
-              <w:t>Calcular importe a devolver</w:t>
-            </w:r>
-            <w:r>
-              <w:rPr>
-                <w:rFonts w:hint="default"/>
-                <w:lang w:val="es-MX"/>
-              </w:rPr>
               <w:t xml:space="preserve"> y </w:t>
             </w:r>
             <w:r>
               <w:rPr>
                 <w:rFonts w:hint="default"/>
               </w:rPr>
-              <w:t>Generar nota de crédito</w:t>
+              <w:t>Calcular score</w:t>
             </w:r>
           </w:p>
         </w:tc>
@@ -1759,7 +1744,7 @@
                 <w:rFonts w:hint="default"/>
                 <w:lang w:val="es-MX"/>
               </w:rPr>
-              <w:t xml:space="preserve"> No aplica</w:t>
+              <w:t xml:space="preserve"> Gestionar crédito</w:t>
             </w:r>
           </w:p>
         </w:tc>
@@ -1802,8 +1787,6 @@
             <w:r>
               <w:t>o aplica</w:t>
             </w:r>
-            <w:bookmarkStart w:id="0" w:name="_GoBack"/>
-            <w:bookmarkEnd w:id="0"/>
           </w:p>
         </w:tc>
       </w:tr>
@@ -1849,7 +1832,10 @@
         </w:tc>
       </w:tr>
     </w:tbl>
-    <w:p/>
+    <w:p>
+      <w:bookmarkStart w:id="0" w:name="_GoBack"/>
+      <w:bookmarkEnd w:id="0"/>
+    </w:p>
     <w:p>
       <w:pPr>
         <w:spacing w:line="276" w:lineRule="auto"/>
@@ -1914,6 +1900,26 @@
     </w:p>
   </w:footnote>
 </w:footnotes>
+</file>
+
+<file path=word/numbering.xml><?xml version="1.0" encoding="utf-8"?>
+<w:numbering xmlns:wpc="http://schemas.microsoft.com/office/word/2010/wordprocessingCanvas" xmlns:mc="http://schemas.openxmlformats.org/markup-compatibility/2006" xmlns:o="urn:schemas-microsoft-com:office:office" xmlns:r="http://schemas.openxmlformats.org/officeDocument/2006/relationships" xmlns:m="http://schemas.openxmlformats.org/officeDocument/2006/math" xmlns:v="urn:schemas-microsoft-com:vml" xmlns:wp14="http://schemas.microsoft.com/office/word/2010/wordprocessingDrawing" xmlns:wp="http://schemas.openxmlformats.org/drawingml/2006/wordprocessingDrawing" xmlns:w10="urn:schemas-microsoft-com:office:word" xmlns:w="http://schemas.openxmlformats.org/wordprocessingml/2006/main" xmlns:w14="http://schemas.microsoft.com/office/word/2010/wordml" xmlns:wpg="http://schemas.microsoft.com/office/word/2010/wordprocessingGroup" xmlns:wpi="http://schemas.microsoft.com/office/word/2010/wordprocessingInk" xmlns:wne="http://schemas.microsoft.com/office/word/2006/wordml" xmlns:wps="http://schemas.microsoft.com/office/word/2010/wordprocessingShape" xmlns:wpsCustomData="http://www.wps.cn/officeDocument/2013/wpsCustomData" mc:Ignorable="w14 wp14">
+  <w:abstractNum w:abstractNumId="0">
+    <w:nsid w:val="5C4F5701"/>
+    <w:multiLevelType w:val="singleLevel"/>
+    <w:tmpl w:val="5C4F5701"/>
+    <w:lvl w:ilvl="0" w:tentative="0">
+      <w:start w:val="3"/>
+      <w:numFmt w:val="decimal"/>
+      <w:suff w:val="space"/>
+      <w:lvlText w:val="%1."/>
+      <w:lvlJc w:val="left"/>
+    </w:lvl>
+  </w:abstractNum>
+  <w:num w:numId="1">
+    <w:abstractNumId w:val="0"/>
+  </w:num>
+</w:numbering>
 </file>
 
 <file path=word/styles.xml><?xml version="1.0" encoding="utf-8"?>
@@ -2406,12 +2412,9 @@
 </file>
 
 <file path=customXml/item2.xml><?xml version="1.0" encoding="utf-8"?>
-<?mso-contentType ?>
-<FormTemplates xmlns="http://schemas.microsoft.com/sharepoint/v3/contenttype/forms">
-  <Display>DocumentLibraryForm</Display>
-  <Edit>DocumentLibraryForm</Edit>
-  <New>DocumentLibraryForm</New>
-</FormTemplates>
+<p:properties xmlns:p="http://schemas.microsoft.com/office/2006/metadata/properties" xmlns:xsi="http://www.w3.org/2001/XMLSchema-instance" xmlns:pc="http://schemas.microsoft.com/office/infopath/2007/PartnerControls">
+  <documentManagement/>
+</p:properties>
 </file>
 
 <file path=customXml/item3.xml><?xml version="1.0" encoding="utf-8"?>
@@ -2529,9 +2532,12 @@
 </file>
 
 <file path=customXml/item4.xml><?xml version="1.0" encoding="utf-8"?>
-<p:properties xmlns:p="http://schemas.microsoft.com/office/2006/metadata/properties" xmlns:xsi="http://www.w3.org/2001/XMLSchema-instance" xmlns:pc="http://schemas.microsoft.com/office/infopath/2007/PartnerControls">
-  <documentManagement/>
-</p:properties>
+<?mso-contentType ?>
+<FormTemplates xmlns="http://schemas.microsoft.com/sharepoint/v3/contenttype/forms">
+  <Display>DocumentLibraryForm</Display>
+  <Edit>DocumentLibraryForm</Edit>
+  <New>DocumentLibraryForm</New>
+</FormTemplates>
 </file>
 
 <file path=customXml/itemProps1.xml><?xml version="1.0" encoding="utf-8"?>
@@ -2543,7 +2549,7 @@
 </file>
 
 <file path=customXml/itemProps2.xml><?xml version="1.0" encoding="utf-8"?>
-<ds:datastoreItem xmlns:ds="http://schemas.openxmlformats.org/officeDocument/2006/customXml" ds:itemID="{67E9B3C8-8EB5-4E4C-ADEE-70B6197AA4AD}">
+<ds:datastoreItem xmlns:ds="http://schemas.openxmlformats.org/officeDocument/2006/customXml" ds:itemID="{3235D19B-92AA-40D1-A250-F0977FEF6321}">
   <ds:schemaRefs/>
 </ds:datastoreItem>
 </file>
@@ -2555,7 +2561,7 @@
 </file>
 
 <file path=customXml/itemProps4.xml><?xml version="1.0" encoding="utf-8"?>
-<ds:datastoreItem xmlns:ds="http://schemas.openxmlformats.org/officeDocument/2006/customXml" ds:itemID="{3235D19B-92AA-40D1-A250-F0977FEF6321}">
+<ds:datastoreItem xmlns:ds="http://schemas.openxmlformats.org/officeDocument/2006/customXml" ds:itemID="{67E9B3C8-8EB5-4E4C-ADEE-70B6197AA4AD}">
   <ds:schemaRefs/>
 </ds:datastoreItem>
 </file>
</xml_diff>